<commit_message>
trying to generate dataset using ai but it is failing because of free tier credit system for api keys
</commit_message>
<xml_diff>
--- a/docs/human trace features.docx
+++ b/docs/human trace features.docx
@@ -6147,7 +6147,15 @@
         <w:jc w:val="center"/>
       </w:pPr>
       <w:r>
-        <w:t>College essays       Personal essays     Public essays</w:t>
+        <w:t xml:space="preserve">College essays       Personal essays     </w:t>
+      </w:r>
+      <w:proofErr w:type="gramStart"/>
+      <w:r>
+        <w:t>Public</w:t>
+      </w:r>
+      <w:proofErr w:type="gramEnd"/>
+      <w:r>
+        <w:t xml:space="preserve"> essays</w:t>
       </w:r>
     </w:p>
     <w:p>
@@ -7279,6 +7287,967 @@
       <w:r>
         <w:t xml:space="preserve">                    FRONTEND</w:t>
       </w:r>
+    </w:p>
+    <w:p>
+      <w:pPr>
+        <w:spacing w:after="0"/>
+      </w:pPr>
+      <w:r>
+        <w:lastRenderedPageBreak/>
+        <w:t>============================================================</w:t>
+      </w:r>
+    </w:p>
+    <w:p>
+      <w:pPr>
+        <w:spacing w:after="0"/>
+      </w:pPr>
+      <w:r>
+        <w:t>TRAINING COMPLETE</w:t>
+      </w:r>
+    </w:p>
+    <w:p>
+      <w:pPr>
+        <w:spacing w:after="0"/>
+      </w:pPr>
+      <w:r>
+        <w:t>Model saved to:</w:t>
+      </w:r>
+    </w:p>
+    <w:p>
+      <w:pPr>
+        <w:pBdr>
+          <w:bottom w:val="double" w:sz="6" w:space="1" w:color="auto"/>
+        </w:pBdr>
+        <w:spacing w:after="0"/>
+      </w:pPr>
+      <w:r>
+        <w:t>C:\Users\Harkiran\OneDrive\humantrace\models\saved\humantrace-distilbert</w:t>
+      </w:r>
+    </w:p>
+    <w:p>
+      <w:pPr>
+        <w:spacing w:after="0"/>
+      </w:pPr>
+    </w:p>
+    <w:p>
+      <w:pPr>
+        <w:spacing w:after="0"/>
+      </w:pPr>
+      <w:r>
+        <w:t>(.</w:t>
+      </w:r>
+      <w:proofErr w:type="spellStart"/>
+      <w:r>
+        <w:t>venv</w:t>
+      </w:r>
+      <w:proofErr w:type="spellEnd"/>
+      <w:r>
+        <w:t xml:space="preserve">) C:\Users\Harkiran\OneDrive&gt;python -m </w:t>
+      </w:r>
+      <w:proofErr w:type="spellStart"/>
+      <w:r>
+        <w:t>humantrace.models.evaluate</w:t>
+      </w:r>
+      <w:proofErr w:type="spellEnd"/>
+    </w:p>
+    <w:p>
+      <w:pPr>
+        <w:spacing w:after="0"/>
+      </w:pPr>
+      <w:r>
+        <w:t>============================================================</w:t>
+      </w:r>
+    </w:p>
+    <w:p>
+      <w:pPr>
+        <w:spacing w:after="0"/>
+      </w:pPr>
+      <w:proofErr w:type="spellStart"/>
+      <w:r>
+        <w:t>HumanTrace</w:t>
+      </w:r>
+      <w:proofErr w:type="spellEnd"/>
+      <w:r>
+        <w:t xml:space="preserve"> Model Evaluation</w:t>
+      </w:r>
+    </w:p>
+    <w:p>
+      <w:pPr>
+        <w:spacing w:after="0"/>
+      </w:pPr>
+      <w:r>
+        <w:t>============================================================</w:t>
+      </w:r>
+    </w:p>
+    <w:p>
+      <w:pPr>
+        <w:spacing w:after="0"/>
+      </w:pPr>
+    </w:p>
+    <w:p>
+      <w:pPr>
+        <w:spacing w:after="0"/>
+      </w:pPr>
+      <w:r>
+        <w:t>Test records: 384</w:t>
+      </w:r>
+    </w:p>
+    <w:p>
+      <w:pPr>
+        <w:spacing w:after="0"/>
+      </w:pPr>
+      <w:r>
+        <w:t>Loading weights: 100%|</w:t>
+      </w:r>
+      <w:r>
+        <w:rPr>
+          <w:rFonts w:ascii="Arial" w:hAnsi="Arial" w:cs="Arial"/>
+        </w:rPr>
+        <w:t>████████████████████████████████████████████████████████████████████████████████████</w:t>
+      </w:r>
+      <w:r>
+        <w:t>| 104/104 [00:00&lt;00:00, 3249.61it/s]</w:t>
+      </w:r>
+    </w:p>
+    <w:p>
+      <w:pPr>
+        <w:spacing w:after="0"/>
+      </w:pPr>
+    </w:p>
+    <w:p>
+      <w:pPr>
+        <w:spacing w:after="0"/>
+      </w:pPr>
+      <w:r>
+        <w:t>Running predictions...</w:t>
+      </w:r>
+    </w:p>
+    <w:p>
+      <w:pPr>
+        <w:spacing w:after="0"/>
+      </w:pPr>
+    </w:p>
+    <w:p>
+      <w:pPr>
+        <w:spacing w:after="0"/>
+      </w:pPr>
+      <w:r>
+        <w:t>============================================================</w:t>
+      </w:r>
+    </w:p>
+    <w:p>
+      <w:pPr>
+        <w:spacing w:after="0"/>
+      </w:pPr>
+      <w:r>
+        <w:t>RESULTS</w:t>
+      </w:r>
+    </w:p>
+    <w:p>
+      <w:pPr>
+        <w:spacing w:after="0"/>
+      </w:pPr>
+      <w:r>
+        <w:t>============================================================</w:t>
+      </w:r>
+    </w:p>
+    <w:p>
+      <w:pPr>
+        <w:spacing w:after="0"/>
+      </w:pPr>
+    </w:p>
+    <w:p>
+      <w:pPr>
+        <w:spacing w:after="0"/>
+      </w:pPr>
+      <w:r>
+        <w:t>Accuracy : 0.9974</w:t>
+      </w:r>
+    </w:p>
+    <w:p>
+      <w:pPr>
+        <w:spacing w:after="0"/>
+      </w:pPr>
+      <w:r>
+        <w:t>Precision: 0.9967</w:t>
+      </w:r>
+    </w:p>
+    <w:p>
+      <w:pPr>
+        <w:spacing w:after="0"/>
+      </w:pPr>
+      <w:r>
+        <w:t>Recall   : 1.0000</w:t>
+      </w:r>
+    </w:p>
+    <w:p>
+      <w:pPr>
+        <w:spacing w:after="0"/>
+      </w:pPr>
+      <w:r>
+        <w:t>F1 Score : 0.9983</w:t>
+      </w:r>
+    </w:p>
+    <w:p>
+      <w:pPr>
+        <w:spacing w:after="0"/>
+      </w:pPr>
+    </w:p>
+    <w:p>
+      <w:pPr>
+        <w:spacing w:after="0"/>
+      </w:pPr>
+      <w:r>
+        <w:t>Confusion Matrix:</w:t>
+      </w:r>
+    </w:p>
+    <w:p>
+      <w:pPr>
+        <w:spacing w:after="0"/>
+      </w:pPr>
+      <w:r>
+        <w:t>[[ 83   1]</w:t>
+      </w:r>
+    </w:p>
+    <w:p>
+      <w:pPr>
+        <w:spacing w:after="0"/>
+      </w:pPr>
+      <w:r>
+        <w:t xml:space="preserve"> [  0 300]]</w:t>
+      </w:r>
+    </w:p>
+    <w:p>
+      <w:pPr>
+        <w:spacing w:after="0"/>
+      </w:pPr>
+    </w:p>
+    <w:p>
+      <w:pPr>
+        <w:spacing w:after="0"/>
+      </w:pPr>
+      <w:r>
+        <w:t>Classification Report:</w:t>
+      </w:r>
+    </w:p>
+    <w:p>
+      <w:pPr>
+        <w:spacing w:after="0"/>
+      </w:pPr>
+      <w:r>
+        <w:t xml:space="preserve">              precision    recall  f1-score   support</w:t>
+      </w:r>
+    </w:p>
+    <w:p>
+      <w:pPr>
+        <w:spacing w:after="0"/>
+      </w:pPr>
+    </w:p>
+    <w:p>
+      <w:pPr>
+        <w:spacing w:after="0"/>
+      </w:pPr>
+      <w:r>
+        <w:t xml:space="preserve">       human       1.00      0.99      0.99        84</w:t>
+      </w:r>
+    </w:p>
+    <w:p>
+      <w:pPr>
+        <w:spacing w:after="0"/>
+      </w:pPr>
+      <w:r>
+        <w:t xml:space="preserve">          ai       1.00      1.00      1.00       300</w:t>
+      </w:r>
+    </w:p>
+    <w:p>
+      <w:pPr>
+        <w:spacing w:after="0"/>
+      </w:pPr>
+    </w:p>
+    <w:p>
+      <w:pPr>
+        <w:spacing w:after="0"/>
+      </w:pPr>
+      <w:r>
+        <w:t xml:space="preserve">    accuracy                           1.00       384</w:t>
+      </w:r>
+    </w:p>
+    <w:p>
+      <w:pPr>
+        <w:spacing w:after="0"/>
+      </w:pPr>
+      <w:r>
+        <w:t xml:space="preserve">   macro </w:t>
+      </w:r>
+      <w:proofErr w:type="spellStart"/>
+      <w:r>
+        <w:t>avg</w:t>
+      </w:r>
+      <w:proofErr w:type="spellEnd"/>
+      <w:r>
+        <w:t xml:space="preserve">       1.00      0.99      1.00       384</w:t>
+      </w:r>
+    </w:p>
+    <w:p>
+      <w:pPr>
+        <w:spacing w:after="0"/>
+      </w:pPr>
+      <w:r>
+        <w:t xml:space="preserve">weighted </w:t>
+      </w:r>
+      <w:proofErr w:type="spellStart"/>
+      <w:r>
+        <w:t>avg</w:t>
+      </w:r>
+      <w:proofErr w:type="spellEnd"/>
+      <w:r>
+        <w:t xml:space="preserve">       1.00      1.00      1.00       384</w:t>
+      </w:r>
+    </w:p>
+    <w:p>
+      <w:pPr>
+        <w:spacing w:after="0"/>
+      </w:pPr>
+    </w:p>
+    <w:p>
+      <w:pPr>
+        <w:spacing w:after="0"/>
+      </w:pPr>
+      <w:r>
+        <w:t>============================================================</w:t>
+      </w:r>
+    </w:p>
+    <w:p>
+      <w:pPr>
+        <w:spacing w:after="0"/>
+      </w:pPr>
+    </w:p>
+    <w:p>
+      <w:pPr>
+        <w:spacing w:after="0"/>
+      </w:pPr>
+      <w:r>
+        <w:t>(.</w:t>
+      </w:r>
+      <w:proofErr w:type="spellStart"/>
+      <w:r>
+        <w:t>venv</w:t>
+      </w:r>
+      <w:proofErr w:type="spellEnd"/>
+      <w:r>
+        <w:t>) C:\Users\Harkiran\OneDrive&gt;</w:t>
+      </w:r>
+    </w:p>
+    <w:p>
+      <w:pPr>
+        <w:spacing w:after="0"/>
+      </w:pPr>
+    </w:p>
+    <w:p>
+      <w:pPr>
+        <w:spacing w:after="0"/>
+        <w:rPr>
+          <w:sz w:val="40"/>
+          <w:szCs w:val="40"/>
+        </w:rPr>
+      </w:pPr>
+      <w:r>
+        <w:rPr>
+          <w:sz w:val="40"/>
+          <w:szCs w:val="40"/>
+        </w:rPr>
+        <w:t xml:space="preserve">means the model is </w:t>
+      </w:r>
+      <w:r>
+        <w:rPr>
+          <w:b/>
+          <w:bCs/>
+          <w:sz w:val="40"/>
+          <w:szCs w:val="40"/>
+        </w:rPr>
+        <w:t>very likely overfitting</w:t>
+      </w:r>
+      <w:r>
+        <w:rPr>
+          <w:sz w:val="40"/>
+          <w:szCs w:val="40"/>
+        </w:rPr>
+        <w:t>.</w:t>
+      </w:r>
+    </w:p>
+    <w:p>
+      <w:pPr>
+        <w:spacing w:after="0"/>
+      </w:pPr>
+    </w:p>
+    <w:p>
+      <w:r>
+        <w:br w:type="page"/>
+      </w:r>
+    </w:p>
+    <w:tbl>
+      <w:tblPr>
+        <w:tblW w:w="0" w:type="auto"/>
+        <w:tblCellSpacing w:w="15" w:type="dxa"/>
+        <w:tblCellMar>
+          <w:top w:w="15" w:type="dxa"/>
+          <w:left w:w="15" w:type="dxa"/>
+          <w:bottom w:w="15" w:type="dxa"/>
+          <w:right w:w="15" w:type="dxa"/>
+        </w:tblCellMar>
+        <w:tblLook w:val="04A0" w:firstRow="1" w:lastRow="0" w:firstColumn="1" w:lastColumn="0" w:noHBand="0" w:noVBand="1"/>
+      </w:tblPr>
+      <w:tblGrid>
+        <w:gridCol w:w="1566"/>
+        <w:gridCol w:w="1206"/>
+      </w:tblGrid>
+      <w:tr>
+        <w:trPr>
+          <w:tblHeader/>
+          <w:tblCellSpacing w:w="15" w:type="dxa"/>
+        </w:trPr>
+        <w:tc>
+          <w:tcPr>
+            <w:tcW w:w="0" w:type="auto"/>
+            <w:vAlign w:val="center"/>
+            <w:hideMark/>
+          </w:tcPr>
+          <w:p>
+            <w:pPr>
+              <w:spacing w:after="0"/>
+              <w:rPr>
+                <w:b/>
+                <w:bCs/>
+              </w:rPr>
+            </w:pPr>
+            <w:r>
+              <w:rPr>
+                <w:b/>
+                <w:bCs/>
+              </w:rPr>
+              <w:lastRenderedPageBreak/>
+              <w:t>Source</w:t>
+            </w:r>
+          </w:p>
+        </w:tc>
+        <w:tc>
+          <w:tcPr>
+            <w:tcW w:w="0" w:type="auto"/>
+            <w:vAlign w:val="center"/>
+            <w:hideMark/>
+          </w:tcPr>
+          <w:p>
+            <w:pPr>
+              <w:spacing w:after="0"/>
+              <w:rPr>
+                <w:b/>
+                <w:bCs/>
+              </w:rPr>
+            </w:pPr>
+            <w:r>
+              <w:rPr>
+                <w:b/>
+                <w:bCs/>
+              </w:rPr>
+              <w:t>Target</w:t>
+            </w:r>
+          </w:p>
+        </w:tc>
+      </w:tr>
+      <w:tr>
+        <w:trPr>
+          <w:tblCellSpacing w:w="15" w:type="dxa"/>
+        </w:trPr>
+        <w:tc>
+          <w:tcPr>
+            <w:tcW w:w="0" w:type="auto"/>
+            <w:vAlign w:val="center"/>
+            <w:hideMark/>
+          </w:tcPr>
+          <w:p>
+            <w:pPr>
+              <w:spacing w:after="0"/>
+            </w:pPr>
+            <w:r>
+              <w:t>HC3 Human</w:t>
+            </w:r>
+          </w:p>
+        </w:tc>
+        <w:tc>
+          <w:tcPr>
+            <w:tcW w:w="0" w:type="auto"/>
+            <w:vAlign w:val="center"/>
+            <w:hideMark/>
+          </w:tcPr>
+          <w:p>
+            <w:pPr>
+              <w:spacing w:after="0"/>
+            </w:pPr>
+            <w:r>
+              <w:t>2,000</w:t>
+            </w:r>
+          </w:p>
+        </w:tc>
+      </w:tr>
+      <w:tr>
+        <w:trPr>
+          <w:tblCellSpacing w:w="15" w:type="dxa"/>
+        </w:trPr>
+        <w:tc>
+          <w:tcPr>
+            <w:tcW w:w="0" w:type="auto"/>
+            <w:vAlign w:val="center"/>
+            <w:hideMark/>
+          </w:tcPr>
+          <w:p>
+            <w:pPr>
+              <w:spacing w:after="0"/>
+            </w:pPr>
+            <w:r>
+              <w:t>Student Essays</w:t>
+            </w:r>
+          </w:p>
+        </w:tc>
+        <w:tc>
+          <w:tcPr>
+            <w:tcW w:w="0" w:type="auto"/>
+            <w:vAlign w:val="center"/>
+            <w:hideMark/>
+          </w:tcPr>
+          <w:p>
+            <w:pPr>
+              <w:spacing w:after="0"/>
+            </w:pPr>
+            <w:r>
+              <w:t>2,000</w:t>
+            </w:r>
+          </w:p>
+        </w:tc>
+      </w:tr>
+      <w:tr>
+        <w:trPr>
+          <w:tblCellSpacing w:w="15" w:type="dxa"/>
+        </w:trPr>
+        <w:tc>
+          <w:tcPr>
+            <w:tcW w:w="0" w:type="auto"/>
+            <w:vAlign w:val="center"/>
+            <w:hideMark/>
+          </w:tcPr>
+          <w:p>
+            <w:pPr>
+              <w:spacing w:after="0"/>
+            </w:pPr>
+            <w:r>
+              <w:t>Reddit</w:t>
+            </w:r>
+          </w:p>
+        </w:tc>
+        <w:tc>
+          <w:tcPr>
+            <w:tcW w:w="0" w:type="auto"/>
+            <w:vAlign w:val="center"/>
+            <w:hideMark/>
+          </w:tcPr>
+          <w:p>
+            <w:pPr>
+              <w:spacing w:after="0"/>
+            </w:pPr>
+            <w:r>
+              <w:t>2,000</w:t>
+            </w:r>
+          </w:p>
+        </w:tc>
+      </w:tr>
+      <w:tr>
+        <w:trPr>
+          <w:tblCellSpacing w:w="15" w:type="dxa"/>
+        </w:trPr>
+        <w:tc>
+          <w:tcPr>
+            <w:tcW w:w="0" w:type="auto"/>
+            <w:vAlign w:val="center"/>
+            <w:hideMark/>
+          </w:tcPr>
+          <w:p>
+            <w:pPr>
+              <w:spacing w:after="0"/>
+            </w:pPr>
+            <w:r>
+              <w:t>Stack Exchange</w:t>
+            </w:r>
+          </w:p>
+        </w:tc>
+        <w:tc>
+          <w:tcPr>
+            <w:tcW w:w="0" w:type="auto"/>
+            <w:vAlign w:val="center"/>
+            <w:hideMark/>
+          </w:tcPr>
+          <w:p>
+            <w:pPr>
+              <w:spacing w:after="0"/>
+            </w:pPr>
+            <w:r>
+              <w:t>2,000</w:t>
+            </w:r>
+          </w:p>
+        </w:tc>
+      </w:tr>
+      <w:tr>
+        <w:trPr>
+          <w:tblCellSpacing w:w="15" w:type="dxa"/>
+        </w:trPr>
+        <w:tc>
+          <w:tcPr>
+            <w:tcW w:w="0" w:type="auto"/>
+            <w:vAlign w:val="center"/>
+            <w:hideMark/>
+          </w:tcPr>
+          <w:p>
+            <w:pPr>
+              <w:spacing w:after="0"/>
+            </w:pPr>
+            <w:r>
+              <w:t>Gutenberg</w:t>
+            </w:r>
+          </w:p>
+        </w:tc>
+        <w:tc>
+          <w:tcPr>
+            <w:tcW w:w="0" w:type="auto"/>
+            <w:vAlign w:val="center"/>
+            <w:hideMark/>
+          </w:tcPr>
+          <w:p>
+            <w:pPr>
+              <w:spacing w:after="0"/>
+            </w:pPr>
+            <w:r>
+              <w:t>2,000</w:t>
+            </w:r>
+          </w:p>
+        </w:tc>
+      </w:tr>
+      <w:tr>
+        <w:trPr>
+          <w:tblCellSpacing w:w="15" w:type="dxa"/>
+        </w:trPr>
+        <w:tc>
+          <w:tcPr>
+            <w:tcW w:w="0" w:type="auto"/>
+            <w:vAlign w:val="center"/>
+            <w:hideMark/>
+          </w:tcPr>
+          <w:p>
+            <w:pPr>
+              <w:spacing w:after="0"/>
+            </w:pPr>
+            <w:r>
+              <w:t>GPT-4o</w:t>
+            </w:r>
+          </w:p>
+        </w:tc>
+        <w:tc>
+          <w:tcPr>
+            <w:tcW w:w="0" w:type="auto"/>
+            <w:vAlign w:val="center"/>
+            <w:hideMark/>
+          </w:tcPr>
+          <w:p>
+            <w:pPr>
+              <w:spacing w:after="0"/>
+            </w:pPr>
+            <w:r>
+              <w:t>2,000</w:t>
+            </w:r>
+          </w:p>
+        </w:tc>
+      </w:tr>
+      <w:tr>
+        <w:trPr>
+          <w:tblCellSpacing w:w="15" w:type="dxa"/>
+        </w:trPr>
+        <w:tc>
+          <w:tcPr>
+            <w:tcW w:w="0" w:type="auto"/>
+            <w:vAlign w:val="center"/>
+            <w:hideMark/>
+          </w:tcPr>
+          <w:p>
+            <w:pPr>
+              <w:spacing w:after="0"/>
+            </w:pPr>
+            <w:r>
+              <w:t>Gemini</w:t>
+            </w:r>
+          </w:p>
+        </w:tc>
+        <w:tc>
+          <w:tcPr>
+            <w:tcW w:w="0" w:type="auto"/>
+            <w:vAlign w:val="center"/>
+            <w:hideMark/>
+          </w:tcPr>
+          <w:p>
+            <w:pPr>
+              <w:spacing w:after="0"/>
+            </w:pPr>
+            <w:r>
+              <w:t>2,000</w:t>
+            </w:r>
+          </w:p>
+        </w:tc>
+      </w:tr>
+      <w:tr>
+        <w:trPr>
+          <w:tblCellSpacing w:w="15" w:type="dxa"/>
+        </w:trPr>
+        <w:tc>
+          <w:tcPr>
+            <w:tcW w:w="0" w:type="auto"/>
+            <w:vAlign w:val="center"/>
+            <w:hideMark/>
+          </w:tcPr>
+          <w:p>
+            <w:pPr>
+              <w:spacing w:after="0"/>
+            </w:pPr>
+            <w:r>
+              <w:t>Claude</w:t>
+            </w:r>
+          </w:p>
+        </w:tc>
+        <w:tc>
+          <w:tcPr>
+            <w:tcW w:w="0" w:type="auto"/>
+            <w:vAlign w:val="center"/>
+            <w:hideMark/>
+          </w:tcPr>
+          <w:p>
+            <w:pPr>
+              <w:spacing w:after="0"/>
+            </w:pPr>
+            <w:r>
+              <w:t>2,000</w:t>
+            </w:r>
+          </w:p>
+        </w:tc>
+      </w:tr>
+      <w:tr>
+        <w:trPr>
+          <w:tblCellSpacing w:w="15" w:type="dxa"/>
+        </w:trPr>
+        <w:tc>
+          <w:tcPr>
+            <w:tcW w:w="0" w:type="auto"/>
+            <w:vAlign w:val="center"/>
+            <w:hideMark/>
+          </w:tcPr>
+          <w:p>
+            <w:pPr>
+              <w:spacing w:after="0"/>
+            </w:pPr>
+            <w:r>
+              <w:t>RAID</w:t>
+            </w:r>
+          </w:p>
+        </w:tc>
+        <w:tc>
+          <w:tcPr>
+            <w:tcW w:w="0" w:type="auto"/>
+            <w:vAlign w:val="center"/>
+            <w:hideMark/>
+          </w:tcPr>
+          <w:p>
+            <w:pPr>
+              <w:spacing w:after="0"/>
+            </w:pPr>
+            <w:r>
+              <w:t>all available</w:t>
+            </w:r>
+          </w:p>
+        </w:tc>
+      </w:tr>
+      <w:tr>
+        <w:trPr>
+          <w:tblCellSpacing w:w="15" w:type="dxa"/>
+        </w:trPr>
+        <w:tc>
+          <w:tcPr>
+            <w:tcW w:w="0" w:type="auto"/>
+            <w:vAlign w:val="center"/>
+            <w:hideMark/>
+          </w:tcPr>
+          <w:p>
+            <w:pPr>
+              <w:spacing w:after="0"/>
+            </w:pPr>
+            <w:r>
+              <w:t>HC3 AI</w:t>
+            </w:r>
+          </w:p>
+        </w:tc>
+        <w:tc>
+          <w:tcPr>
+            <w:tcW w:w="0" w:type="auto"/>
+            <w:vAlign w:val="center"/>
+            <w:hideMark/>
+          </w:tcPr>
+          <w:p>
+            <w:pPr>
+              <w:spacing w:after="0"/>
+            </w:pPr>
+            <w:r>
+              <w:t>all available</w:t>
+            </w:r>
+          </w:p>
+        </w:tc>
+      </w:tr>
+    </w:tbl>
+    <w:p>
+      <w:pPr>
+        <w:spacing w:after="0"/>
+      </w:pPr>
+    </w:p>
+    <w:p>
+      <w:pPr>
+        <w:spacing w:after="0"/>
+      </w:pPr>
+    </w:p>
+    <w:p>
+      <w:pPr>
+        <w:spacing w:after="0"/>
+      </w:pPr>
+    </w:p>
+    <w:p>
+      <w:pPr>
+        <w:spacing w:after="0"/>
+      </w:pPr>
+      <w:r>
+        <w:t>(.</w:t>
+      </w:r>
+      <w:proofErr w:type="spellStart"/>
+      <w:r>
+        <w:t>venv</w:t>
+      </w:r>
+      <w:proofErr w:type="spellEnd"/>
+      <w:r>
+        <w:t xml:space="preserve">) C:\Users\Harkiran\OneDrive&gt;python -m </w:t>
+      </w:r>
+      <w:proofErr w:type="spellStart"/>
+      <w:r>
+        <w:t>humantrace.generation.generate_dataset</w:t>
+      </w:r>
+      <w:proofErr w:type="spellEnd"/>
+      <w:r>
+        <w:t xml:space="preserve"> --divide</w:t>
+      </w:r>
+    </w:p>
+    <w:p>
+      <w:pPr>
+        <w:spacing w:after="0"/>
+      </w:pPr>
+    </w:p>
+    <w:p>
+      <w:pPr>
+        <w:spacing w:after="0"/>
+      </w:pPr>
+      <w:r>
+        <w:t>============================================================</w:t>
+      </w:r>
+    </w:p>
+    <w:p>
+      <w:pPr>
+        <w:spacing w:after="0"/>
+      </w:pPr>
+      <w:r>
+        <w:t>DIVIDING TOPICS</w:t>
+      </w:r>
+    </w:p>
+    <w:p>
+      <w:pPr>
+        <w:spacing w:after="0"/>
+      </w:pPr>
+      <w:r>
+        <w:t>============================================================</w:t>
+      </w:r>
+    </w:p>
+    <w:p>
+      <w:pPr>
+        <w:spacing w:after="0"/>
+      </w:pPr>
+      <w:r>
+        <w:t>Total topics: 1000</w:t>
+      </w:r>
+    </w:p>
+    <w:p>
+      <w:pPr>
+        <w:spacing w:after="0"/>
+      </w:pPr>
+      <w:proofErr w:type="spellStart"/>
+      <w:r>
+        <w:t>openai</w:t>
+      </w:r>
+      <w:proofErr w:type="spellEnd"/>
+      <w:r>
+        <w:t xml:space="preserve">      334 topics -&gt; gpt_topics.txt</w:t>
+      </w:r>
+    </w:p>
+    <w:p>
+      <w:pPr>
+        <w:spacing w:after="0"/>
+      </w:pPr>
+      <w:proofErr w:type="spellStart"/>
+      <w:r>
+        <w:t>gemini</w:t>
+      </w:r>
+      <w:proofErr w:type="spellEnd"/>
+      <w:r>
+        <w:t xml:space="preserve">      333 topics -&gt; gemini_topics.txt</w:t>
+      </w:r>
+    </w:p>
+    <w:p>
+      <w:pPr>
+        <w:spacing w:after="0"/>
+      </w:pPr>
+      <w:proofErr w:type="spellStart"/>
+      <w:r>
+        <w:t>claude</w:t>
+      </w:r>
+      <w:proofErr w:type="spellEnd"/>
+      <w:r>
+        <w:t xml:space="preserve">      333 topics -&gt; claude_topics.txt</w:t>
+      </w:r>
+    </w:p>
+    <w:p>
+      <w:pPr>
+        <w:spacing w:after="0"/>
+      </w:pPr>
+      <w:r>
+        <w:t>============================================================</w:t>
+      </w:r>
+    </w:p>
+    <w:p>
+      <w:pPr>
+        <w:spacing w:after="0"/>
+      </w:pPr>
+      <w:r>
+        <w:t>TOPIC DIVISION COMPLETE</w:t>
+      </w:r>
+    </w:p>
+    <w:p>
+      <w:pPr>
+        <w:spacing w:after="0"/>
+      </w:pPr>
+      <w:r>
+        <w:t>============================================================</w:t>
+      </w:r>
+    </w:p>
+    <w:p>
+      <w:pPr>
+        <w:spacing w:after="0"/>
+      </w:pPr>
     </w:p>
     <w:sectPr>
       <w:pgSz w:w="11906" w:h="16838"/>
@@ -7893,7 +8862,6 @@
   <w:style w:type="character" w:default="1" w:styleId="DefaultParagraphFont">
     <w:name w:val="Default Paragraph Font"/>
     <w:uiPriority w:val="1"/>
-    <w:semiHidden/>
     <w:unhideWhenUsed/>
   </w:style>
   <w:style w:type="table" w:default="1" w:styleId="TableNormal">

</xml_diff>

<commit_message>
modle trained on wikipedia dataset 98% now
</commit_message>
<xml_diff>
--- a/docs/human trace features.docx
+++ b/docs/human trace features.docx
@@ -6147,15 +6147,7 @@
         <w:jc w:val="center"/>
       </w:pPr>
       <w:r>
-        <w:t xml:space="preserve">College essays       Personal essays     </w:t>
-      </w:r>
-      <w:proofErr w:type="gramStart"/>
-      <w:r>
-        <w:t>Public</w:t>
-      </w:r>
-      <w:proofErr w:type="gramEnd"/>
-      <w:r>
-        <w:t xml:space="preserve"> essays</w:t>
+        <w:t>College essays       Personal essays     Public essays</w:t>
       </w:r>
     </w:p>
     <w:p>
@@ -8248,6 +8240,511 @@
       <w:pPr>
         <w:spacing w:after="0"/>
       </w:pPr>
+    </w:p>
+    <w:p>
+      <w:pPr>
+        <w:spacing w:after="0"/>
+      </w:pPr>
+      <w:r>
+        <w:t>(.</w:t>
+      </w:r>
+      <w:proofErr w:type="spellStart"/>
+      <w:r>
+        <w:t>venv</w:t>
+      </w:r>
+      <w:proofErr w:type="spellEnd"/>
+      <w:r>
+        <w:t>) C:\Users\Harkiran\OneDrive&gt;python -u "c:\Users\Harkiran\OneDrive\humantrace\datasets\scripts\merge_datasets.py"</w:t>
+      </w:r>
+    </w:p>
+    <w:p>
+      <w:pPr>
+        <w:spacing w:after="0"/>
+      </w:pPr>
+      <w:r>
+        <w:t xml:space="preserve">Merging: </w:t>
+      </w:r>
+      <w:proofErr w:type="spellStart"/>
+      <w:r>
+        <w:t>raid_normalized.jsonl</w:t>
+      </w:r>
+      <w:proofErr w:type="spellEnd"/>
+    </w:p>
+    <w:p>
+      <w:pPr>
+        <w:spacing w:after="0"/>
+      </w:pPr>
+      <w:r>
+        <w:t>Merging: hc3_ai_normalized.jsonl</w:t>
+      </w:r>
+    </w:p>
+    <w:p>
+      <w:pPr>
+        <w:spacing w:after="0"/>
+      </w:pPr>
+      <w:r>
+        <w:t>Merging: hc3_human_normalized.jsonl</w:t>
+      </w:r>
+    </w:p>
+    <w:p>
+      <w:pPr>
+        <w:spacing w:after="0"/>
+      </w:pPr>
+      <w:r>
+        <w:t xml:space="preserve">Merging: </w:t>
+      </w:r>
+      <w:proofErr w:type="spellStart"/>
+      <w:r>
+        <w:t>wikipedia_normalized.jsonl</w:t>
+      </w:r>
+      <w:proofErr w:type="spellEnd"/>
+    </w:p>
+    <w:p>
+      <w:pPr>
+        <w:spacing w:after="0"/>
+      </w:pPr>
+    </w:p>
+    <w:p>
+      <w:pPr>
+        <w:spacing w:after="0"/>
+      </w:pPr>
+      <w:r>
+        <w:t>Dataset merge complete.</w:t>
+      </w:r>
+    </w:p>
+    <w:p>
+      <w:pPr>
+        <w:spacing w:after="0"/>
+      </w:pPr>
+      <w:r>
+        <w:t>Total records: 4241</w:t>
+      </w:r>
+    </w:p>
+    <w:p>
+      <w:pPr>
+        <w:spacing w:after="0"/>
+      </w:pPr>
+      <w:r>
+        <w:t>Output: C:\Users\Harkiran\OneDrive\humantrace\datasets\processed\humantrace_dataset.jsonl</w:t>
+      </w:r>
+    </w:p>
+    <w:p>
+      <w:pPr>
+        <w:spacing w:after="0"/>
+      </w:pPr>
+    </w:p>
+    <w:p>
+      <w:pPr>
+        <w:spacing w:after="0"/>
+      </w:pPr>
+      <w:r>
+        <w:t>(.</w:t>
+      </w:r>
+      <w:proofErr w:type="spellStart"/>
+      <w:r>
+        <w:t>venv</w:t>
+      </w:r>
+      <w:proofErr w:type="spellEnd"/>
+      <w:r>
+        <w:t xml:space="preserve">) C:\Users\Harkiran\OneDrive&gt;python -m </w:t>
+      </w:r>
+      <w:proofErr w:type="spellStart"/>
+      <w:r>
+        <w:t>humantrace.datasets.scripts.split_dataset</w:t>
+      </w:r>
+      <w:proofErr w:type="spellEnd"/>
+    </w:p>
+    <w:p>
+      <w:pPr>
+        <w:spacing w:after="0"/>
+      </w:pPr>
+      <w:r>
+        <w:t>Loaded 4241 records.</w:t>
+      </w:r>
+    </w:p>
+    <w:p>
+      <w:pPr>
+        <w:spacing w:after="0"/>
+      </w:pPr>
+      <w:r>
+        <w:t xml:space="preserve">ai: 3000 total → 2400 train, 300 </w:t>
+      </w:r>
+      <w:proofErr w:type="spellStart"/>
+      <w:r>
+        <w:t>val</w:t>
+      </w:r>
+      <w:proofErr w:type="spellEnd"/>
+      <w:r>
+        <w:t>, 300 test</w:t>
+      </w:r>
+    </w:p>
+    <w:p>
+      <w:pPr>
+        <w:spacing w:after="0"/>
+      </w:pPr>
+      <w:r>
+        <w:t xml:space="preserve">human: 1241 total → 992 train, 124 </w:t>
+      </w:r>
+      <w:proofErr w:type="spellStart"/>
+      <w:r>
+        <w:t>val</w:t>
+      </w:r>
+      <w:proofErr w:type="spellEnd"/>
+      <w:r>
+        <w:t>, 125 test</w:t>
+      </w:r>
+    </w:p>
+    <w:p>
+      <w:pPr>
+        <w:spacing w:after="0"/>
+      </w:pPr>
+    </w:p>
+    <w:p>
+      <w:pPr>
+        <w:spacing w:after="0"/>
+      </w:pPr>
+      <w:r>
+        <w:lastRenderedPageBreak/>
+        <w:t>Dataset splitting complete.</w:t>
+      </w:r>
+    </w:p>
+    <w:p>
+      <w:pPr>
+        <w:spacing w:after="0"/>
+      </w:pPr>
+      <w:r>
+        <w:t>Train: 3392</w:t>
+      </w:r>
+    </w:p>
+    <w:p>
+      <w:pPr>
+        <w:spacing w:after="0"/>
+      </w:pPr>
+      <w:r>
+        <w:t>Validation: 424</w:t>
+      </w:r>
+    </w:p>
+    <w:p>
+      <w:pPr>
+        <w:spacing w:after="0"/>
+      </w:pPr>
+      <w:r>
+        <w:t>Test: 425</w:t>
+      </w:r>
+    </w:p>
+    <w:p>
+      <w:pPr>
+        <w:spacing w:after="0"/>
+      </w:pPr>
+    </w:p>
+    <w:p>
+      <w:pPr>
+        <w:spacing w:after="0"/>
+      </w:pPr>
+    </w:p>
+    <w:p>
+      <w:pPr>
+        <w:spacing w:after="0"/>
+      </w:pPr>
+      <w:r>
+        <w:t>(.</w:t>
+      </w:r>
+      <w:proofErr w:type="spellStart"/>
+      <w:r>
+        <w:t>venv</w:t>
+      </w:r>
+      <w:proofErr w:type="spellEnd"/>
+      <w:r>
+        <w:t xml:space="preserve">) PS C:\Users\Harkiran\OneDrive&gt; python -m </w:t>
+      </w:r>
+      <w:proofErr w:type="spellStart"/>
+      <w:r>
+        <w:t>humantrace.models.evaluate</w:t>
+      </w:r>
+      <w:proofErr w:type="spellEnd"/>
+    </w:p>
+    <w:p>
+      <w:pPr>
+        <w:spacing w:after="0"/>
+      </w:pPr>
+      <w:r>
+        <w:t>============================================================</w:t>
+      </w:r>
+    </w:p>
+    <w:p>
+      <w:pPr>
+        <w:spacing w:after="0"/>
+      </w:pPr>
+      <w:proofErr w:type="spellStart"/>
+      <w:r>
+        <w:t>HumanTrace</w:t>
+      </w:r>
+      <w:proofErr w:type="spellEnd"/>
+      <w:r>
+        <w:t xml:space="preserve"> Model Evaluation</w:t>
+      </w:r>
+    </w:p>
+    <w:p>
+      <w:pPr>
+        <w:spacing w:after="0"/>
+      </w:pPr>
+      <w:r>
+        <w:t>============================================================</w:t>
+      </w:r>
+    </w:p>
+    <w:p>
+      <w:pPr>
+        <w:spacing w:after="0"/>
+      </w:pPr>
+    </w:p>
+    <w:p>
+      <w:pPr>
+        <w:spacing w:after="0"/>
+      </w:pPr>
+      <w:r>
+        <w:t>Test records: 425</w:t>
+      </w:r>
+    </w:p>
+    <w:p>
+      <w:pPr>
+        <w:spacing w:after="0"/>
+      </w:pPr>
+      <w:r>
+        <w:t>Loading weights: 100%|</w:t>
+      </w:r>
+      <w:r>
+        <w:rPr>
+          <w:rFonts w:ascii="Arial" w:hAnsi="Arial" w:cs="Arial"/>
+        </w:rPr>
+        <w:t>█████████████████████████████████████████████████████████████████████████████████████████████████████</w:t>
+      </w:r>
+      <w:r>
+        <w:t>| 104/104 [00:00&lt;00:00, 1799.20it/s]</w:t>
+      </w:r>
+    </w:p>
+    <w:p>
+      <w:pPr>
+        <w:spacing w:after="0"/>
+      </w:pPr>
+    </w:p>
+    <w:p>
+      <w:pPr>
+        <w:spacing w:after="0"/>
+      </w:pPr>
+      <w:r>
+        <w:t>Running predictions...</w:t>
+      </w:r>
+    </w:p>
+    <w:p>
+      <w:pPr>
+        <w:spacing w:after="0"/>
+      </w:pPr>
+    </w:p>
+    <w:p>
+      <w:pPr>
+        <w:spacing w:after="0"/>
+      </w:pPr>
+      <w:r>
+        <w:t>============================================================</w:t>
+      </w:r>
+    </w:p>
+    <w:p>
+      <w:pPr>
+        <w:spacing w:after="0"/>
+      </w:pPr>
+      <w:r>
+        <w:t>RESULTS</w:t>
+      </w:r>
+    </w:p>
+    <w:p>
+      <w:pPr>
+        <w:spacing w:after="0"/>
+      </w:pPr>
+      <w:r>
+        <w:t>============================================================</w:t>
+      </w:r>
+    </w:p>
+    <w:p>
+      <w:pPr>
+        <w:spacing w:after="0"/>
+      </w:pPr>
+    </w:p>
+    <w:p>
+      <w:pPr>
+        <w:spacing w:after="0"/>
+      </w:pPr>
+      <w:r>
+        <w:t>Accuracy : 0.9882</w:t>
+      </w:r>
+    </w:p>
+    <w:p>
+      <w:pPr>
+        <w:spacing w:after="0"/>
+      </w:pPr>
+      <w:r>
+        <w:t>Precision: 0.9900</w:t>
+      </w:r>
+    </w:p>
+    <w:p>
+      <w:pPr>
+        <w:spacing w:after="0"/>
+      </w:pPr>
+      <w:r>
+        <w:t>Recall   : 0.9933</w:t>
+      </w:r>
+    </w:p>
+    <w:p>
+      <w:pPr>
+        <w:spacing w:after="0"/>
+      </w:pPr>
+      <w:r>
+        <w:t>F1 Score : 0.9917</w:t>
+      </w:r>
+    </w:p>
+    <w:p>
+      <w:pPr>
+        <w:spacing w:after="0"/>
+      </w:pPr>
+    </w:p>
+    <w:p>
+      <w:pPr>
+        <w:spacing w:after="0"/>
+      </w:pPr>
+      <w:r>
+        <w:t>Confusion Matrix:</w:t>
+      </w:r>
+    </w:p>
+    <w:p>
+      <w:pPr>
+        <w:spacing w:after="0"/>
+      </w:pPr>
+      <w:r>
+        <w:t>[[122   3]</w:t>
+      </w:r>
+    </w:p>
+    <w:p>
+      <w:pPr>
+        <w:spacing w:after="0"/>
+      </w:pPr>
+      <w:r>
+        <w:t xml:space="preserve"> [  2 298]]</w:t>
+      </w:r>
+    </w:p>
+    <w:p>
+      <w:pPr>
+        <w:spacing w:after="0"/>
+      </w:pPr>
+    </w:p>
+    <w:p>
+      <w:pPr>
+        <w:spacing w:after="0"/>
+      </w:pPr>
+      <w:r>
+        <w:t>Classification Report:</w:t>
+      </w:r>
+    </w:p>
+    <w:p>
+      <w:pPr>
+        <w:spacing w:after="0"/>
+      </w:pPr>
+      <w:r>
+        <w:t xml:space="preserve">              precision    recall  f1-score   support</w:t>
+      </w:r>
+    </w:p>
+    <w:p>
+      <w:pPr>
+        <w:spacing w:after="0"/>
+      </w:pPr>
+    </w:p>
+    <w:p>
+      <w:pPr>
+        <w:spacing w:after="0"/>
+      </w:pPr>
+      <w:r>
+        <w:t xml:space="preserve">       human       0.98      0.98      0.98       125</w:t>
+      </w:r>
+    </w:p>
+    <w:p>
+      <w:pPr>
+        <w:spacing w:after="0"/>
+      </w:pPr>
+      <w:r>
+        <w:t xml:space="preserve">          ai       0.99      0.99      0.99       300</w:t>
+      </w:r>
+    </w:p>
+    <w:p>
+      <w:pPr>
+        <w:spacing w:after="0"/>
+      </w:pPr>
+    </w:p>
+    <w:p>
+      <w:pPr>
+        <w:spacing w:after="0"/>
+      </w:pPr>
+      <w:r>
+        <w:t xml:space="preserve">    accuracy                           0.99       425</w:t>
+      </w:r>
+    </w:p>
+    <w:p>
+      <w:pPr>
+        <w:spacing w:after="0"/>
+      </w:pPr>
+      <w:r>
+        <w:t xml:space="preserve">   macro </w:t>
+      </w:r>
+      <w:proofErr w:type="spellStart"/>
+      <w:r>
+        <w:t>avg</w:t>
+      </w:r>
+      <w:proofErr w:type="spellEnd"/>
+      <w:r>
+        <w:t xml:space="preserve">       0.99      0.98      0.99       425</w:t>
+      </w:r>
+    </w:p>
+    <w:p>
+      <w:pPr>
+        <w:spacing w:after="0"/>
+      </w:pPr>
+      <w:r>
+        <w:t xml:space="preserve">weighted </w:t>
+      </w:r>
+      <w:proofErr w:type="spellStart"/>
+      <w:r>
+        <w:t>avg</w:t>
+      </w:r>
+      <w:proofErr w:type="spellEnd"/>
+      <w:r>
+        <w:t xml:space="preserve">       0.99      0.99      0.99       425</w:t>
+      </w:r>
+    </w:p>
+    <w:p>
+      <w:pPr>
+        <w:spacing w:after="0"/>
+      </w:pPr>
+    </w:p>
+    <w:p>
+      <w:pPr>
+        <w:spacing w:after="0"/>
+      </w:pPr>
+      <w:r>
+        <w:t>============================================================</w:t>
+      </w:r>
+    </w:p>
+    <w:p>
+      <w:pPr>
+        <w:spacing w:after="0"/>
+      </w:pPr>
+      <w:r>
+        <w:t>(.</w:t>
+      </w:r>
+      <w:proofErr w:type="spellStart"/>
+      <w:r>
+        <w:t>venv</w:t>
+      </w:r>
+      <w:proofErr w:type="spellEnd"/>
+      <w:r>
+        <w:t>) PS C:\Users\Harkiran\OneDrive&gt;</w:t>
+      </w:r>
     </w:p>
     <w:sectPr>
       <w:pgSz w:w="11906" w:h="16838"/>
@@ -8862,6 +9359,7 @@
   <w:style w:type="character" w:default="1" w:styleId="DefaultParagraphFont">
     <w:name w:val="Default Paragraph Font"/>
     <w:uiPriority w:val="1"/>
+    <w:semiHidden/>
     <w:unhideWhenUsed/>
   </w:style>
   <w:style w:type="table" w:default="1" w:styleId="TableNormal">

</xml_diff>

<commit_message>
ADDED FINAL ARCHITECTURE TO MY LOG
</commit_message>
<xml_diff>
--- a/docs/human trace features.docx
+++ b/docs/human trace features.docx
@@ -8822,6 +8822,311 @@
       <w:r>
         <w:t>healthy</w:t>
       </w:r>
+    </w:p>
+    <w:p>
+      <w:r>
+        <w:br w:type="page"/>
+      </w:r>
+    </w:p>
+    <w:p>
+      <w:pPr>
+        <w:spacing w:after="0"/>
+      </w:pPr>
+      <w:r>
+        <w:lastRenderedPageBreak/>
+        <w:t>FINAL ARCHITECTURE</w:t>
+      </w:r>
+    </w:p>
+    <w:p>
+      <w:pPr>
+        <w:spacing w:after="0"/>
+      </w:pPr>
+      <w:r>
+        <w:t>┌──────────────────────────┐</w:t>
+      </w:r>
+    </w:p>
+    <w:p>
+      <w:pPr>
+        <w:spacing w:after="0"/>
+      </w:pPr>
+      <w:r>
+        <w:t xml:space="preserve">│   humantrace-frontend    </w:t>
+      </w:r>
+      <w:r>
+        <w:t xml:space="preserve">           </w:t>
+      </w:r>
+      <w:r>
+        <w:t>│</w:t>
+      </w:r>
+    </w:p>
+    <w:p>
+      <w:pPr>
+        <w:spacing w:after="0"/>
+      </w:pPr>
+      <w:r>
+        <w:t xml:space="preserve">│       Next.js 16     </w:t>
+      </w:r>
+      <w:r>
+        <w:t xml:space="preserve">                           </w:t>
+      </w:r>
+      <w:r>
+        <w:t xml:space="preserve">    │</w:t>
+      </w:r>
+    </w:p>
+    <w:p>
+      <w:pPr>
+        <w:spacing w:after="0"/>
+      </w:pPr>
+      <w:r>
+        <w:t xml:space="preserve">│                          </w:t>
+      </w:r>
+      <w:r>
+        <w:t xml:space="preserve">                                      </w:t>
+      </w:r>
+      <w:r>
+        <w:t>│</w:t>
+      </w:r>
+    </w:p>
+    <w:p>
+      <w:pPr>
+        <w:spacing w:after="0"/>
+      </w:pPr>
+      <w:r>
+        <w:t xml:space="preserve">│ Text / PDF / DOCX        </w:t>
+      </w:r>
+      <w:r>
+        <w:t xml:space="preserve">                  </w:t>
+      </w:r>
+      <w:r>
+        <w:t>│</w:t>
+      </w:r>
+    </w:p>
+    <w:p>
+      <w:pPr>
+        <w:spacing w:after="0"/>
+      </w:pPr>
+      <w:r>
+        <w:t>└────────────</w:t>
+      </w:r>
+      <w:r>
+        <w:rPr>
+          <w:rFonts w:ascii="MS Gothic" w:eastAsia="MS Gothic" w:hAnsi="MS Gothic" w:cs="MS Gothic" w:hint="eastAsia"/>
+        </w:rPr>
+        <w:t>┬</w:t>
+      </w:r>
+      <w:r>
+        <w:rPr>
+          <w:rFonts w:ascii="Aptos" w:hAnsi="Aptos" w:cs="Aptos"/>
+        </w:rPr>
+        <w:t>────────────┘</w:t>
+      </w:r>
+    </w:p>
+    <w:p>
+      <w:pPr>
+        <w:spacing w:after="0"/>
+      </w:pPr>
+      <w:r>
+        <w:t xml:space="preserve">             │</w:t>
+      </w:r>
+    </w:p>
+    <w:p>
+      <w:pPr>
+        <w:spacing w:after="0"/>
+      </w:pPr>
+      <w:r>
+        <w:t xml:space="preserve">             │ REST API</w:t>
+      </w:r>
+    </w:p>
+    <w:p>
+      <w:pPr>
+        <w:spacing w:after="0"/>
+      </w:pPr>
+      <w:r>
+        <w:t xml:space="preserve">             </w:t>
+      </w:r>
+      <w:r>
+        <w:rPr>
+          <w:rFonts w:ascii="Arial" w:hAnsi="Arial" w:cs="Arial"/>
+        </w:rPr>
+        <w:t>▼</w:t>
+      </w:r>
+    </w:p>
+    <w:p>
+      <w:pPr>
+        <w:spacing w:after="0"/>
+      </w:pPr>
+      <w:r>
+        <w:t>┌──────────────────────────┐</w:t>
+      </w:r>
+    </w:p>
+    <w:p>
+      <w:pPr>
+        <w:spacing w:after="0"/>
+      </w:pPr>
+      <w:r>
+        <w:t xml:space="preserve">│       humantrace         </w:t>
+      </w:r>
+      <w:r>
+        <w:t xml:space="preserve">                      </w:t>
+      </w:r>
+      <w:r>
+        <w:t>│</w:t>
+      </w:r>
+    </w:p>
+    <w:p>
+      <w:pPr>
+        <w:spacing w:after="0"/>
+      </w:pPr>
+      <w:r>
+        <w:t xml:space="preserve">│       Flask API          </w:t>
+      </w:r>
+      <w:r>
+        <w:t xml:space="preserve">                            </w:t>
+      </w:r>
+      <w:r>
+        <w:t>│</w:t>
+      </w:r>
+    </w:p>
+    <w:p>
+      <w:pPr>
+        <w:spacing w:after="0"/>
+      </w:pPr>
+      <w:r>
+        <w:t xml:space="preserve">│                          </w:t>
+      </w:r>
+      <w:r>
+        <w:t xml:space="preserve">                                      </w:t>
+      </w:r>
+      <w:r>
+        <w:t>│</w:t>
+      </w:r>
+    </w:p>
+    <w:p>
+      <w:pPr>
+        <w:spacing w:after="0"/>
+      </w:pPr>
+      <w:r>
+        <w:t xml:space="preserve">│   models/predict.py      </w:t>
+      </w:r>
+      <w:r>
+        <w:t xml:space="preserve">                </w:t>
+      </w:r>
+      <w:r>
+        <w:t>│</w:t>
+      </w:r>
+    </w:p>
+    <w:p>
+      <w:pPr>
+        <w:spacing w:after="0"/>
+      </w:pPr>
+      <w:r>
+        <w:t>└────────────</w:t>
+      </w:r>
+      <w:r>
+        <w:rPr>
+          <w:rFonts w:ascii="MS Gothic" w:eastAsia="MS Gothic" w:hAnsi="MS Gothic" w:cs="MS Gothic" w:hint="eastAsia"/>
+        </w:rPr>
+        <w:t>┬</w:t>
+      </w:r>
+      <w:r>
+        <w:rPr>
+          <w:rFonts w:ascii="Aptos" w:hAnsi="Aptos" w:cs="Aptos"/>
+        </w:rPr>
+        <w:t>────────────┘</w:t>
+      </w:r>
+    </w:p>
+    <w:p>
+      <w:pPr>
+        <w:spacing w:after="0"/>
+      </w:pPr>
+      <w:r>
+        <w:t xml:space="preserve">             │</w:t>
+      </w:r>
+    </w:p>
+    <w:p>
+      <w:pPr>
+        <w:spacing w:after="0"/>
+      </w:pPr>
+      <w:r>
+        <w:t xml:space="preserve">             │ Model inference</w:t>
+      </w:r>
+    </w:p>
+    <w:p>
+      <w:pPr>
+        <w:spacing w:after="0"/>
+      </w:pPr>
+      <w:r>
+        <w:t xml:space="preserve">             </w:t>
+      </w:r>
+      <w:r>
+        <w:rPr>
+          <w:rFonts w:ascii="Arial" w:hAnsi="Arial" w:cs="Arial"/>
+        </w:rPr>
+        <w:t>▼</w:t>
+      </w:r>
+    </w:p>
+    <w:p>
+      <w:pPr>
+        <w:spacing w:after="0"/>
+      </w:pPr>
+      <w:r>
+        <w:t>┌──────────────────────────┐</w:t>
+      </w:r>
+    </w:p>
+    <w:p>
+      <w:pPr>
+        <w:spacing w:after="0"/>
+      </w:pPr>
+      <w:r>
+        <w:t xml:space="preserve">│ Hugging Face             </w:t>
+      </w:r>
+      <w:r>
+        <w:t xml:space="preserve">                     </w:t>
+      </w:r>
+      <w:r>
+        <w:t>│</w:t>
+      </w:r>
+    </w:p>
+    <w:p>
+      <w:pPr>
+        <w:spacing w:after="0"/>
+      </w:pPr>
+      <w:r>
+        <w:t xml:space="preserve">│ harkirankaur/            </w:t>
+      </w:r>
+      <w:r>
+        <w:t xml:space="preserve">                      </w:t>
+      </w:r>
+      <w:r>
+        <w:t>│</w:t>
+      </w:r>
+    </w:p>
+    <w:p>
+      <w:pPr>
+        <w:spacing w:after="0"/>
+      </w:pPr>
+      <w:r>
+        <w:t xml:space="preserve">│ humantrace-distilbert    </w:t>
+      </w:r>
+      <w:r>
+        <w:t xml:space="preserve">            </w:t>
+      </w:r>
+      <w:r>
+        <w:t>│</w:t>
+      </w:r>
+    </w:p>
+    <w:p>
+      <w:pPr>
+        <w:spacing w:after="0"/>
+      </w:pPr>
+      <w:r>
+        <w:t>└──────────────────────────┘</w:t>
+      </w:r>
+    </w:p>
+    <w:p>
+      <w:pPr>
+        <w:spacing w:after="0"/>
+      </w:pPr>
     </w:p>
     <w:sectPr>
       <w:pgSz w:w="11906" w:h="16838"/>
@@ -10049,6 +10354,7 @@
   <w:style w:type="character" w:default="1" w:styleId="DefaultParagraphFont">
     <w:name w:val="Default Paragraph Font"/>
     <w:uiPriority w:val="1"/>
+    <w:semiHidden/>
     <w:unhideWhenUsed/>
   </w:style>
   <w:style w:type="table" w:default="1" w:styleId="TableNormal">
@@ -10362,6 +10668,25 @@
       <w:spacing w:val="5"/>
     </w:rPr>
   </w:style>
+  <w:style w:type="table" w:styleId="TableGrid">
+    <w:name w:val="Table Grid"/>
+    <w:basedOn w:val="TableNormal"/>
+    <w:uiPriority w:val="39"/>
+    <w:rsid w:val="00B022A3"/>
+    <w:pPr>
+      <w:spacing w:after="0" w:line="240" w:lineRule="auto"/>
+    </w:pPr>
+    <w:tblPr>
+      <w:tblBorders>
+        <w:top w:val="single" w:sz="4" w:space="0" w:color="auto"/>
+        <w:left w:val="single" w:sz="4" w:space="0" w:color="auto"/>
+        <w:bottom w:val="single" w:sz="4" w:space="0" w:color="auto"/>
+        <w:right w:val="single" w:sz="4" w:space="0" w:color="auto"/>
+        <w:insideH w:val="single" w:sz="4" w:space="0" w:color="auto"/>
+        <w:insideV w:val="single" w:sz="4" w:space="0" w:color="auto"/>
+      </w:tblBorders>
+    </w:tblPr>
+  </w:style>
 </w:styles>
 </file>
 

</xml_diff>